<commit_message>
Finalise policy ingestion and refresh documentation
</commit_message>
<xml_diff>
--- a/docs/policy_ingestion_and_chunking_prototype_handover_user-guide.docx
+++ b/docs/policy_ingestion_and_chunking_prototype_handover_user-guide.docx
@@ -1,6 +1,6 @@
 
 <file path=word/document.xml><?xml version="1.0" encoding="utf-8"?>
-<w:document xmlns:wpc="http://schemas.microsoft.com/office/word/2010/wordprocessingCanvas" xmlns:cx="http://schemas.microsoft.com/office/drawing/2014/chartex" xmlns:cx1="http://schemas.microsoft.com/office/drawing/2015/9/8/chartex" xmlns:cx2="http://schemas.microsoft.com/office/drawing/2015/10/21/chartex" xmlns:cx3="http://schemas.microsoft.com/office/drawing/2016/5/9/chartex" xmlns:cx4="http://schemas.microsoft.com/office/drawing/2016/5/10/chartex" xmlns:cx5="http://schemas.microsoft.com/office/drawing/2016/5/11/chartex" xmlns:cx6="http://schemas.microsoft.com/office/drawing/2016/5/12/chartex" xmlns:cx7="http://schemas.microsoft.com/office/drawing/2016/5/13/chartex" xmlns:cx8="http://schemas.microsoft.com/office/drawing/2016/5/14/chartex" xmlns:mc="http://schemas.openxmlformats.org/markup-compatibility/2006" xmlns:aink="http://schemas.microsoft.com/office/drawing/2016/ink" xmlns:am3d="http://schemas.microsoft.com/office/drawing/2017/model3d" xmlns:o="urn:schemas-microsoft-com:office:office" xmlns:oel="http://schemas.microsoft.com/office/2019/extlst" xmlns:r="http://schemas.openxmlformats.org/officeDocument/2006/relationships" xmlns:m="http://schemas.openxmlformats.org/officeDocument/2006/math" xmlns:v="urn:schemas-microsoft-com:vml" xmlns:wp14="http://schemas.microsoft.com/office/word/2010/wordprocessingDrawing" xmlns:wp="http://schemas.openxmlformats.org/drawingml/2006/wordprocessingDrawing" xmlns:w10="urn:schemas-microsoft-com:office:word" xmlns:w="http://schemas.openxmlformats.org/wordprocessingml/2006/main" xmlns:w14="http://schemas.microsoft.com/office/word/2010/wordml" xmlns:w15="http://schemas.microsoft.com/office/word/2012/wordml" xmlns:w16cei="http://schemas.microsoft.com/office/word/2026/wordml/cei" xmlns:w16cex="http://schemas.microsoft.com/office/word/2018/wordml/cex" xmlns:w16cid="http://schemas.microsoft.com/office/word/2016/wordml/cid" xmlns:w16="http://schemas.microsoft.com/office/word/2018/wordml" xmlns:w16du="http://schemas.microsoft.com/office/word/2023/wordml/word16du" xmlns:w16sdtdh="http://schemas.microsoft.com/office/word/2020/wordml/sdtdatahash" xmlns:w16sdtfl="http://schemas.microsoft.com/office/word/2024/wordml/sdtformatlock" xmlns:w16se="http://schemas.microsoft.com/office/word/2015/wordml/symex" xmlns:wpg="http://schemas.microsoft.com/office/word/2010/wordprocessingGroup" xmlns:wpi="http://schemas.microsoft.com/office/word/2010/wordprocessingInk" xmlns:wne="http://schemas.microsoft.com/office/word/2006/wordml" xmlns:wps="http://schemas.microsoft.com/office/word/2010/wordprocessingShape" mc:Ignorable="w14 w15 w16se w16cid w16 w16cex w16sdtdh w16sdtfl w16du wp14">
+<w:document xmlns:wpc="http://schemas.microsoft.com/office/word/2010/wordprocessingCanvas" xmlns:cx="http://schemas.microsoft.com/office/drawing/2014/chartex" xmlns:cx1="http://schemas.microsoft.com/office/drawing/2015/9/8/chartex" xmlns:cx2="http://schemas.microsoft.com/office/drawing/2015/10/21/chartex" xmlns:cx3="http://schemas.microsoft.com/office/drawing/2016/5/9/chartex" xmlns:cx4="http://schemas.microsoft.com/office/drawing/2016/5/10/chartex" xmlns:cx5="http://schemas.microsoft.com/office/drawing/2016/5/11/chartex" xmlns:cx6="http://schemas.microsoft.com/office/drawing/2016/5/12/chartex" xmlns:cx7="http://schemas.microsoft.com/office/drawing/2016/5/13/chartex" xmlns:cx8="http://schemas.microsoft.com/office/drawing/2016/5/14/chartex" xmlns:mc="http://schemas.openxmlformats.org/markup-compatibility/2006" xmlns:aink="http://schemas.microsoft.com/office/drawing/2016/ink" xmlns:am3d="http://schemas.microsoft.com/office/drawing/2017/model3d" xmlns:o="urn:schemas-microsoft-com:office:office" xmlns:oel="http://schemas.microsoft.com/office/2019/extlst" xmlns:r="http://schemas.openxmlformats.org/officeDocument/2006/relationships" xmlns:m="http://schemas.openxmlformats.org/officeDocument/2006/math" xmlns:v="urn:schemas-microsoft-com:vml" xmlns:wp14="http://schemas.microsoft.com/office/word/2010/wordprocessingDrawing" xmlns:wp="http://schemas.openxmlformats.org/drawingml/2006/wordprocessingDrawing" xmlns:w10="urn:schemas-microsoft-com:office:word" xmlns:w="http://schemas.openxmlformats.org/wordprocessingml/2006/main" xmlns:w14="http://schemas.microsoft.com/office/word/2010/wordml" xmlns:w15="http://schemas.microsoft.com/office/word/2012/wordml" xmlns:w16cex="http://schemas.microsoft.com/office/word/2018/wordml/cex" xmlns:w16cid="http://schemas.microsoft.com/office/word/2016/wordml/cid" xmlns:w16="http://schemas.microsoft.com/office/word/2018/wordml" xmlns:w16du="http://schemas.microsoft.com/office/word/2023/wordml/word16du" xmlns:w16sdtdh="http://schemas.microsoft.com/office/word/2020/wordml/sdtdatahash" xmlns:w16sdtfl="http://schemas.microsoft.com/office/word/2024/wordml/sdtformatlock" xmlns:w16se="http://schemas.microsoft.com/office/word/2015/wordml/symex" xmlns:wpg="http://schemas.microsoft.com/office/word/2010/wordprocessingGroup" xmlns:wpi="http://schemas.microsoft.com/office/word/2010/wordprocessingInk" xmlns:wne="http://schemas.microsoft.com/office/word/2006/wordml" xmlns:wps="http://schemas.microsoft.com/office/word/2010/wordprocessingShape" mc:Ignorable="w14 w15 w16se w16cid w16 w16cex w16sdtdh w16sdtfl w16du wp14">
   <w:body>
     <w:p>
       <w:pPr>
@@ -18,43 +18,7 @@
           <w:sz w:val="32"/>
           <w:szCs w:val="32"/>
         </w:rPr>
-        <w:t>Project Lex</w:t>
-      </w:r>
-      <w:r>
-        <w:rPr>
-          <w:b/>
-          <w:bCs/>
-          <w:sz w:val="32"/>
-          <w:szCs w:val="32"/>
-        </w:rPr>
-        <w:t xml:space="preserve"> AI</w:t>
-      </w:r>
-      <w:r>
-        <w:rPr>
-          <w:b/>
-          <w:bCs/>
-          <w:sz w:val="32"/>
-          <w:szCs w:val="32"/>
-        </w:rPr>
-        <w:t xml:space="preserve"> </w:t>
-      </w:r>
-      <w:r>
-        <w:rPr>
-          <w:b/>
-          <w:bCs/>
-          <w:sz w:val="32"/>
-          <w:szCs w:val="32"/>
-        </w:rPr>
-        <w:t>-</w:t>
-      </w:r>
-      <w:r>
-        <w:rPr>
-          <w:b/>
-          <w:bCs/>
-          <w:sz w:val="32"/>
-          <w:szCs w:val="32"/>
-        </w:rPr>
-        <w:t xml:space="preserve"> Policy Ingestion and Chunking Prototype</w:t>
+        <w:t>Project Lex AI - Policy Ingestion and Chunking Prototype</w:t>
       </w:r>
     </w:p>
     <w:p>
@@ -99,7 +63,13 @@
     </w:p>
     <w:p>
       <w:r>
-        <w:t>The prototype takes authoritative policy content from the La Trobe University Policy Library and converts it into clean, structured and traceable policy chunks suitable for the next stage of the Project Lex Retrieval-Augmented Generation (RAG) pipeline.</w:t>
+        <w:t xml:space="preserve">The prototype takes authoritative policy content from the La Trobe University Policy Library and converts it into clean, structured and traceable policy chunks suitable </w:t>
+      </w:r>
+      <w:r>
+        <w:t xml:space="preserve">for use by the downstream components of </w:t>
+      </w:r>
+      <w:r>
+        <w:t>the Project Lex Retrieval-Augmented Generation (RAG) pipeline.</w:t>
       </w:r>
     </w:p>
     <w:p>
@@ -195,7 +165,23 @@
           <w:b/>
           <w:bCs/>
         </w:rPr>
-        <w:t xml:space="preserve"> Qdrant </w:t>
+        <w:t xml:space="preserve"> </w:t>
+      </w:r>
+      <w:proofErr w:type="spellStart"/>
+      <w:r>
+        <w:rPr>
+          <w:b/>
+          <w:bCs/>
+        </w:rPr>
+        <w:t>Qdrant</w:t>
+      </w:r>
+      <w:proofErr w:type="spellEnd"/>
+      <w:r>
+        <w:rPr>
+          <w:b/>
+          <w:bCs/>
+        </w:rPr>
+        <w:t xml:space="preserve"> </w:t>
       </w:r>
       <w:r>
         <w:rPr>
@@ -253,10 +239,7 @@
         <w:t>policy_processor.py</w:t>
       </w:r>
       <w:r>
-        <w:t xml:space="preserve">: </w:t>
-      </w:r>
-      <w:r>
-        <w:t>Authoritative policy webpages</w:t>
+        <w:t>: Authoritative policy webpages</w:t>
       </w:r>
       <w:r>
         <w:rPr>
@@ -285,10 +268,7 @@
         <w:t>policy_chunker.py</w:t>
       </w:r>
       <w:r>
-        <w:t xml:space="preserve">: </w:t>
-      </w:r>
-      <w:r>
-        <w:t xml:space="preserve">Clean structured policy JSON </w:t>
+        <w:t xml:space="preserve">: Clean structured policy JSON </w:t>
       </w:r>
       <w:r>
         <w:rPr>
@@ -311,7 +291,15 @@
     <w:p/>
     <w:p>
       <w:r>
-        <w:t>The output of the chunker becomes the input to the embedding and vector-database stage.</w:t>
+        <w:t xml:space="preserve">The output of the </w:t>
+      </w:r>
+      <w:proofErr w:type="spellStart"/>
+      <w:r>
+        <w:t>chunker</w:t>
+      </w:r>
+      <w:proofErr w:type="spellEnd"/>
+      <w:r>
+        <w:t xml:space="preserve"> becomes the input to the embedding and vector-database stage.</w:t>
       </w:r>
     </w:p>
     <w:p/>
@@ -323,15 +311,15 @@
         <w:tblLook w:val="04A0" w:firstRow="1" w:lastRow="0" w:firstColumn="1" w:lastColumn="0" w:noHBand="0" w:noVBand="1"/>
       </w:tblPr>
       <w:tblGrid>
-        <w:gridCol w:w="2551"/>
+        <w:gridCol w:w="2390"/>
       </w:tblGrid>
       <w:tr>
         <w:trPr>
-          <w:trHeight w:val="4524"/>
+          <w:trHeight w:val="4377"/>
         </w:trPr>
         <w:tc>
           <w:tcPr>
-            <w:tcW w:w="2551" w:type="dxa"/>
+            <w:tcW w:w="2390" w:type="dxa"/>
           </w:tcPr>
           <w:p>
             <w:pPr>
@@ -433,8 +421,13 @@
             <w:pPr>
               <w:jc w:val="center"/>
             </w:pPr>
-            <w:r>
-              <w:t>Qdrant vector database</w:t>
+            <w:proofErr w:type="spellStart"/>
+            <w:r>
+              <w:t>Qdrant</w:t>
+            </w:r>
+            <w:proofErr w:type="spellEnd"/>
+            <w:r>
+              <w:t xml:space="preserve"> vector database</w:t>
             </w:r>
           </w:p>
           <w:p>
@@ -506,6 +499,7 @@
     </w:p>
     <w:p>
       <w:r>
+        <w:lastRenderedPageBreak/>
         <w:t>It deliberately separates policy acquisition and cleaning from later embedding and retrieval activities.</w:t>
       </w:r>
     </w:p>
@@ -659,8 +653,13 @@
       </w:r>
     </w:p>
     <w:p>
-      <w:r>
-        <w:t>BeautifulSoup is used to interpret the returned HTML.</w:t>
+      <w:proofErr w:type="spellStart"/>
+      <w:r>
+        <w:t>BeautifulSoup</w:t>
+      </w:r>
+      <w:proofErr w:type="spellEnd"/>
+      <w:r>
+        <w:t xml:space="preserve"> is used to interpret the returned HTML.</w:t>
       </w:r>
     </w:p>
     <w:p>
@@ -843,7 +842,6 @@
     <w:p/>
     <w:p>
       <w:r>
-        <w:lastRenderedPageBreak/>
         <w:t>For example:</w:t>
       </w:r>
     </w:p>
@@ -868,13 +866,7 @@
               <w:jc w:val="center"/>
             </w:pPr>
             <w:r>
-              <w:t xml:space="preserve">Section 6 </w:t>
-            </w:r>
-            <w:r>
-              <w:t>-</w:t>
-            </w:r>
-            <w:r>
-              <w:t xml:space="preserve"> Procedures</w:t>
+              <w:t>Section 6 - Procedures</w:t>
             </w:r>
           </w:p>
           <w:p>
@@ -890,13 +882,7 @@
               <w:jc w:val="center"/>
             </w:pPr>
             <w:r>
-              <w:t xml:space="preserve">Part B </w:t>
-            </w:r>
-            <w:r>
-              <w:t>-</w:t>
-            </w:r>
-            <w:r>
-              <w:t xml:space="preserve"> Use and Disclosure</w:t>
+              <w:t>Part B - Use and Disclosure</w:t>
             </w:r>
           </w:p>
           <w:p>
@@ -937,7 +923,15 @@
     <w:p/>
     <w:p>
       <w:r>
-        <w:t>This structure is passed to the chunker rather than being discarded during extraction.</w:t>
+        <w:t xml:space="preserve">This structure is passed to the </w:t>
+      </w:r>
+      <w:proofErr w:type="spellStart"/>
+      <w:r>
+        <w:t>chunker</w:t>
+      </w:r>
+      <w:proofErr w:type="spellEnd"/>
+      <w:r>
+        <w:t xml:space="preserve"> rather than being discarded during extraction.</w:t>
       </w:r>
     </w:p>
     <w:p/>
@@ -987,8 +981,13 @@
       </w:r>
     </w:p>
     <w:p>
-      <w:r>
-        <w:t>view.php?id=[document ID]</w:t>
+      <w:proofErr w:type="spellStart"/>
+      <w:r>
+        <w:t>view.php?id</w:t>
+      </w:r>
+      <w:proofErr w:type="spellEnd"/>
+      <w:r>
+        <w:t>=[document ID]</w:t>
       </w:r>
     </w:p>
     <w:p>
@@ -1013,8 +1012,13 @@
       </w:r>
     </w:p>
     <w:p>
-      <w:r>
-        <w:t>status-and-details.php?id=[document ID]</w:t>
+      <w:proofErr w:type="spellStart"/>
+      <w:r>
+        <w:t>status-and-details.php?id</w:t>
+      </w:r>
+      <w:proofErr w:type="spellEnd"/>
+      <w:r>
+        <w:t>=[document ID]</w:t>
       </w:r>
     </w:p>
     <w:p>
@@ -1190,7 +1194,6 @@
     <w:p/>
     <w:p>
       <w:r>
-        <w:lastRenderedPageBreak/>
         <w:t>A simplified example is:</w:t>
       </w:r>
     </w:p>
@@ -1216,32 +1219,80 @@
           </w:p>
           <w:p>
             <w:r>
-              <w:t xml:space="preserve">    "document_id": "1",</w:t>
-            </w:r>
-          </w:p>
-          <w:p>
-            <w:r>
-              <w:t xml:space="preserve">    "policy_title": "Privacy Policy",</w:t>
-            </w:r>
-          </w:p>
-          <w:p>
-            <w:r>
-              <w:t xml:space="preserve">    "source_url": "...",</w:t>
-            </w:r>
-          </w:p>
-          <w:p>
-            <w:r>
-              <w:t xml:space="preserve">    "status_details_url": "...",</w:t>
-            </w:r>
-          </w:p>
-          <w:p>
-            <w:r>
-              <w:t xml:space="preserve">    "source_system": "La Trobe University Policy Library",</w:t>
-            </w:r>
-          </w:p>
-          <w:p>
-            <w:r>
-              <w:t xml:space="preserve">    "retrieved_at": "...",</w:t>
+              <w:t xml:space="preserve">    "</w:t>
+            </w:r>
+            <w:proofErr w:type="spellStart"/>
+            <w:r>
+              <w:t>document_id</w:t>
+            </w:r>
+            <w:proofErr w:type="spellEnd"/>
+            <w:r>
+              <w:t>": "1",</w:t>
+            </w:r>
+          </w:p>
+          <w:p>
+            <w:r>
+              <w:t xml:space="preserve">    "</w:t>
+            </w:r>
+            <w:proofErr w:type="spellStart"/>
+            <w:r>
+              <w:t>policy_title</w:t>
+            </w:r>
+            <w:proofErr w:type="spellEnd"/>
+            <w:r>
+              <w:t>": "Privacy Policy",</w:t>
+            </w:r>
+          </w:p>
+          <w:p>
+            <w:r>
+              <w:t xml:space="preserve">    "</w:t>
+            </w:r>
+            <w:proofErr w:type="spellStart"/>
+            <w:r>
+              <w:t>source_url</w:t>
+            </w:r>
+            <w:proofErr w:type="spellEnd"/>
+            <w:r>
+              <w:t>": "...",</w:t>
+            </w:r>
+          </w:p>
+          <w:p>
+            <w:r>
+              <w:t xml:space="preserve">    "</w:t>
+            </w:r>
+            <w:proofErr w:type="spellStart"/>
+            <w:r>
+              <w:t>status_details_url</w:t>
+            </w:r>
+            <w:proofErr w:type="spellEnd"/>
+            <w:r>
+              <w:t>": "...",</w:t>
+            </w:r>
+          </w:p>
+          <w:p>
+            <w:r>
+              <w:t xml:space="preserve">    "</w:t>
+            </w:r>
+            <w:proofErr w:type="spellStart"/>
+            <w:r>
+              <w:t>source_system</w:t>
+            </w:r>
+            <w:proofErr w:type="spellEnd"/>
+            <w:r>
+              <w:t>": "La Trobe University Policy Library",</w:t>
+            </w:r>
+          </w:p>
+          <w:p>
+            <w:r>
+              <w:t xml:space="preserve">    "</w:t>
+            </w:r>
+            <w:proofErr w:type="spellStart"/>
+            <w:r>
+              <w:t>retrieved_at</w:t>
+            </w:r>
+            <w:proofErr w:type="spellEnd"/>
+            <w:r>
+              <w:t>": "...",</w:t>
             </w:r>
           </w:p>
           <w:p>
@@ -1251,22 +1302,54 @@
           </w:p>
           <w:p>
             <w:r>
-              <w:t xml:space="preserve">    "effective_date": "31st August 2023",</w:t>
-            </w:r>
-          </w:p>
-          <w:p>
-            <w:r>
-              <w:t xml:space="preserve">    "review_date": "31st August 2026",</w:t>
-            </w:r>
-          </w:p>
-          <w:p>
-            <w:r>
-              <w:t xml:space="preserve">    "approval_authority": "Vice-Chancellor",</w:t>
-            </w:r>
-          </w:p>
-          <w:p>
-            <w:r>
-              <w:t xml:space="preserve">    "approval_date": "17th August 2023",</w:t>
+              <w:t xml:space="preserve">    "</w:t>
+            </w:r>
+            <w:proofErr w:type="spellStart"/>
+            <w:r>
+              <w:t>effective_date</w:t>
+            </w:r>
+            <w:proofErr w:type="spellEnd"/>
+            <w:r>
+              <w:t>": "31st August 2023",</w:t>
+            </w:r>
+          </w:p>
+          <w:p>
+            <w:r>
+              <w:t xml:space="preserve">    "</w:t>
+            </w:r>
+            <w:proofErr w:type="spellStart"/>
+            <w:r>
+              <w:t>review_date</w:t>
+            </w:r>
+            <w:proofErr w:type="spellEnd"/>
+            <w:r>
+              <w:t>": "31st August 2026",</w:t>
+            </w:r>
+          </w:p>
+          <w:p>
+            <w:r>
+              <w:t xml:space="preserve">    "</w:t>
+            </w:r>
+            <w:proofErr w:type="spellStart"/>
+            <w:r>
+              <w:t>approval_authority</w:t>
+            </w:r>
+            <w:proofErr w:type="spellEnd"/>
+            <w:r>
+              <w:t>": "Vice-Chancellor",</w:t>
+            </w:r>
+          </w:p>
+          <w:p>
+            <w:r>
+              <w:t xml:space="preserve">    "</w:t>
+            </w:r>
+            <w:proofErr w:type="spellStart"/>
+            <w:r>
+              <w:t>approval_date</w:t>
+            </w:r>
+            <w:proofErr w:type="spellEnd"/>
+            <w:r>
+              <w:t>": "17th August 2023",</w:t>
             </w:r>
           </w:p>
           <w:p>
@@ -1349,109 +1432,148 @@
           <w:sz w:val="24"/>
           <w:szCs w:val="24"/>
         </w:rPr>
-        <w:t>6. Policy Chunker</w:t>
-      </w:r>
-    </w:p>
-    <w:p>
-      <w:pPr>
-        <w:rPr>
-          <w:b/>
-          <w:bCs/>
-          <w:sz w:val="22"/>
-        </w:rPr>
-      </w:pPr>
-      <w:r>
-        <w:rPr>
-          <w:b/>
-          <w:bCs/>
-          <w:sz w:val="22"/>
-        </w:rPr>
-        <w:t>6.1 Purpose</w:t>
-      </w:r>
-    </w:p>
-    <w:p>
-      <w:r>
-        <w:rPr>
-          <w:b/>
-          <w:bCs/>
-        </w:rPr>
-        <w:t>policy_chunker.py</w:t>
-      </w:r>
-      <w:r>
-        <w:t xml:space="preserve"> takes the processed policy JSON and divides the policy into smaller, meaningful units suitable for embedding and retrieval.</w:t>
-      </w:r>
-    </w:p>
-    <w:p>
-      <w:r>
-        <w:t>The objective is to create chunks that preserve the meaning and provenance of the original policy content.</w:t>
-      </w:r>
-    </w:p>
-    <w:p/>
-    <w:p>
-      <w:pPr>
-        <w:rPr>
-          <w:b/>
-          <w:bCs/>
-          <w:sz w:val="22"/>
-        </w:rPr>
-      </w:pPr>
-      <w:r>
-        <w:rPr>
-          <w:b/>
-          <w:bCs/>
-          <w:sz w:val="22"/>
-        </w:rPr>
-        <w:t>6.2 Why Section-Aware Chunking Is Used</w:t>
-      </w:r>
-    </w:p>
-    <w:p>
-      <w:r>
-        <w:t>A simple RAG implementation could divide every document at an arbitrary character or token count.</w:t>
-      </w:r>
-    </w:p>
-    <w:p>
-      <w:r>
-        <w:t>That approach was not selected for the Project Lex prototype because policy documents already contain meaningful structure.</w:t>
-      </w:r>
-    </w:p>
-    <w:p>
-      <w:r>
-        <w:t>For example, early testing showed that Section 6 of the Privacy Policy contained more than 28,000 characters when treated as a single section.</w:t>
-      </w:r>
-    </w:p>
-    <w:p>
-      <w:r>
-        <w:t>Instead of creating one very large chunk or arbitrarily cutting it into fixed-size pieces, the prototype uses the University's existing heading hierarchy.</w:t>
-      </w:r>
-    </w:p>
-    <w:p>
-      <w:r>
-        <w:t>This allows policy content to be divided according to its semantic structure.</w:t>
-      </w:r>
-    </w:p>
-    <w:p/>
-    <w:p>
-      <w:pPr>
+        <w:t xml:space="preserve">6. Policy </w:t>
+      </w:r>
+      <w:proofErr w:type="spellStart"/>
+      <w:r>
         <w:rPr>
           <w:b/>
           <w:bCs/>
           <w:sz w:val="24"/>
           <w:szCs w:val="24"/>
         </w:rPr>
-      </w:pPr>
-      <w:r>
+        <w:t>Chunker</w:t>
+      </w:r>
+      <w:proofErr w:type="spellEnd"/>
+    </w:p>
+    <w:p>
+      <w:pPr>
+        <w:rPr>
+          <w:b/>
+          <w:bCs/>
+          <w:sz w:val="22"/>
+        </w:rPr>
+      </w:pPr>
+      <w:r>
+        <w:rPr>
+          <w:b/>
+          <w:bCs/>
+          <w:sz w:val="22"/>
+        </w:rPr>
+        <w:t>6.1 Purpose</w:t>
+      </w:r>
+    </w:p>
+    <w:p>
+      <w:r>
+        <w:rPr>
+          <w:b/>
+          <w:bCs/>
+        </w:rPr>
+        <w:t>policy_chunker.py</w:t>
+      </w:r>
+      <w:r>
+        <w:t xml:space="preserve"> takes the processed policy JSON and divides the policy into smaller, meaningful units suitable for embedding and retrieval.</w:t>
+      </w:r>
+    </w:p>
+    <w:p>
+      <w:r>
+        <w:t>The objective is to create chunks that preserve the meaning and provenance of the original policy content.</w:t>
+      </w:r>
+    </w:p>
+    <w:p/>
+    <w:p>
+      <w:pPr>
+        <w:rPr>
+          <w:b/>
+          <w:bCs/>
+          <w:sz w:val="22"/>
+        </w:rPr>
+      </w:pPr>
+      <w:r>
+        <w:rPr>
+          <w:b/>
+          <w:bCs/>
+          <w:sz w:val="22"/>
+        </w:rPr>
+        <w:t>6.2 Why Section-Aware Chunking Is Used</w:t>
+      </w:r>
+    </w:p>
+    <w:p>
+      <w:r>
+        <w:t>A simple RAG implementation could divide every document at an arbitrary character or token count.</w:t>
+      </w:r>
+    </w:p>
+    <w:p>
+      <w:r>
+        <w:t>That approach was not selected for the Project Lex prototype because policy documents already contain meaningful structure.</w:t>
+      </w:r>
+    </w:p>
+    <w:p>
+      <w:r>
+        <w:t>For example, early testing showed that Section 6 of the Privacy Policy contained more than 28,000 characters when treated as a single section.</w:t>
+      </w:r>
+    </w:p>
+    <w:p>
+      <w:r>
+        <w:t>Instead of creating one very large chunk or arbitrarily cutting it into fixed-size pieces, the prototype uses the University's existing heading hierarchy.</w:t>
+      </w:r>
+    </w:p>
+    <w:p>
+      <w:r>
+        <w:t>This allows policy content to be divided according to its semantic structure.</w:t>
+      </w:r>
+    </w:p>
+    <w:p/>
+    <w:p>
+      <w:pPr>
         <w:rPr>
           <w:b/>
           <w:bCs/>
           <w:sz w:val="24"/>
           <w:szCs w:val="24"/>
         </w:rPr>
-        <w:t>7. What the Policy Chunker Does</w:t>
-      </w:r>
-    </w:p>
-    <w:p>
-      <w:r>
-        <w:t>The chunker reads the processed JSON and tracks the policy hierarchy:</w:t>
+      </w:pPr>
+      <w:r>
+        <w:rPr>
+          <w:b/>
+          <w:bCs/>
+          <w:sz w:val="24"/>
+          <w:szCs w:val="24"/>
+        </w:rPr>
+        <w:t xml:space="preserve">7. What the Policy </w:t>
+      </w:r>
+      <w:proofErr w:type="spellStart"/>
+      <w:r>
+        <w:rPr>
+          <w:b/>
+          <w:bCs/>
+          <w:sz w:val="24"/>
+          <w:szCs w:val="24"/>
+        </w:rPr>
+        <w:t>Chunker</w:t>
+      </w:r>
+      <w:proofErr w:type="spellEnd"/>
+      <w:r>
+        <w:rPr>
+          <w:b/>
+          <w:bCs/>
+          <w:sz w:val="24"/>
+          <w:szCs w:val="24"/>
+        </w:rPr>
+        <w:t xml:space="preserve"> Does</w:t>
+      </w:r>
+    </w:p>
+    <w:p>
+      <w:r>
+        <w:t xml:space="preserve">The </w:t>
+      </w:r>
+      <w:proofErr w:type="spellStart"/>
+      <w:r>
+        <w:t>chunker</w:t>
+      </w:r>
+      <w:proofErr w:type="spellEnd"/>
+      <w:r>
+        <w:t xml:space="preserve"> reads the processed JSON and tracks the policy hierarchy:</w:t>
       </w:r>
     </w:p>
     <w:p>
@@ -1523,7 +1645,6 @@
           <w:b/>
           <w:bCs/>
         </w:rPr>
-        <w:lastRenderedPageBreak/>
         <w:t>Identity</w:t>
       </w:r>
     </w:p>
@@ -1535,9 +1656,11 @@
           <w:numId w:val="4"/>
         </w:numPr>
       </w:pPr>
+      <w:proofErr w:type="spellStart"/>
       <w:r>
         <w:t>chunk_id</w:t>
       </w:r>
+      <w:proofErr w:type="spellEnd"/>
     </w:p>
     <w:p>
       <w:pPr>
@@ -1547,9 +1670,11 @@
           <w:numId w:val="4"/>
         </w:numPr>
       </w:pPr>
+      <w:proofErr w:type="spellStart"/>
       <w:r>
         <w:t>document_id</w:t>
       </w:r>
+      <w:proofErr w:type="spellEnd"/>
     </w:p>
     <w:p>
       <w:pPr>
@@ -1559,9 +1684,11 @@
           <w:numId w:val="4"/>
         </w:numPr>
       </w:pPr>
+      <w:proofErr w:type="spellStart"/>
       <w:r>
         <w:t>policy_title</w:t>
       </w:r>
+      <w:proofErr w:type="spellEnd"/>
     </w:p>
     <w:p/>
     <w:p>
@@ -1587,9 +1714,11 @@
           <w:numId w:val="5"/>
         </w:numPr>
       </w:pPr>
+      <w:proofErr w:type="spellStart"/>
       <w:r>
         <w:t>heading_level</w:t>
       </w:r>
+      <w:proofErr w:type="spellEnd"/>
     </w:p>
     <w:p>
       <w:pPr>
@@ -1659,17 +1788,21 @@
       <w:pPr>
         <w:pStyle w:val="ListParagraph"/>
       </w:pPr>
+      <w:proofErr w:type="spellStart"/>
       <w:r>
         <w:t>paragraph_start</w:t>
       </w:r>
+      <w:proofErr w:type="spellEnd"/>
     </w:p>
     <w:p>
       <w:pPr>
         <w:pStyle w:val="ListParagraph"/>
       </w:pPr>
+      <w:proofErr w:type="spellStart"/>
       <w:r>
         <w:t>paragraph_end</w:t>
       </w:r>
+      <w:proofErr w:type="spellEnd"/>
     </w:p>
     <w:p/>
     <w:p>
@@ -1691,17 +1824,21 @@
       <w:pPr>
         <w:pStyle w:val="ListParagraph"/>
       </w:pPr>
+      <w:proofErr w:type="spellStart"/>
       <w:r>
         <w:t>source_url</w:t>
       </w:r>
+      <w:proofErr w:type="spellEnd"/>
     </w:p>
     <w:p>
       <w:pPr>
         <w:pStyle w:val="ListParagraph"/>
       </w:pPr>
+      <w:proofErr w:type="spellStart"/>
       <w:r>
         <w:t>status_details_url</w:t>
       </w:r>
+      <w:proofErr w:type="spellEnd"/>
     </w:p>
     <w:p>
       <w:pPr>
@@ -1715,33 +1852,41 @@
       <w:pPr>
         <w:pStyle w:val="ListParagraph"/>
       </w:pPr>
+      <w:proofErr w:type="spellStart"/>
       <w:r>
         <w:t>effective_date</w:t>
       </w:r>
+      <w:proofErr w:type="spellEnd"/>
     </w:p>
     <w:p>
       <w:pPr>
         <w:pStyle w:val="ListParagraph"/>
       </w:pPr>
+      <w:proofErr w:type="spellStart"/>
       <w:r>
         <w:t>review_date</w:t>
       </w:r>
+      <w:proofErr w:type="spellEnd"/>
     </w:p>
     <w:p>
       <w:pPr>
         <w:pStyle w:val="ListParagraph"/>
       </w:pPr>
+      <w:proofErr w:type="spellStart"/>
       <w:r>
         <w:t>approval_authority</w:t>
       </w:r>
+      <w:proofErr w:type="spellEnd"/>
     </w:p>
     <w:p>
       <w:pPr>
         <w:pStyle w:val="ListParagraph"/>
       </w:pPr>
+      <w:proofErr w:type="spellStart"/>
       <w:r>
         <w:t>approval_date</w:t>
       </w:r>
+      <w:proofErr w:type="spellEnd"/>
     </w:p>
     <w:p>
       <w:pPr>
@@ -2073,6 +2218,7 @@
         </w:rPr>
       </w:pPr>
       <w:r>
+        <w:lastRenderedPageBreak/>
         <w:t xml:space="preserve">Keeping a record is not stored as an isolated piece of text. Project Lex retains the information that it sits underneath Law Enforcement Agencies, which itself sits within </w:t>
       </w:r>
       <w:r>
@@ -2123,10 +2269,10 @@
     </w:p>
     <w:p>
       <w:r>
-        <w:lastRenderedPageBreak/>
         <w:t>This provides considerably stronger retrieval context and future citation capability.</w:t>
       </w:r>
     </w:p>
+    <w:p/>
     <w:p>
       <w:pPr>
         <w:rPr>
@@ -2253,7 +2399,10 @@
         <w:pStyle w:val="ListParagraph"/>
       </w:pPr>
       <w:r>
-        <w:t>correct hierarchy</w:t>
+        <w:t>C</w:t>
+      </w:r>
+      <w:r>
+        <w:t>orrect hierarchy</w:t>
       </w:r>
     </w:p>
     <w:p>
@@ -2261,7 +2410,10 @@
         <w:pStyle w:val="ListParagraph"/>
       </w:pPr>
       <w:r>
-        <w:t>appropriate chunk boundaries</w:t>
+        <w:t>A</w:t>
+      </w:r>
+      <w:r>
+        <w:t>ppropriate chunk boundaries</w:t>
       </w:r>
     </w:p>
     <w:p>
@@ -2269,7 +2421,10 @@
         <w:pStyle w:val="ListParagraph"/>
       </w:pPr>
       <w:r>
-        <w:t>paragraph references</w:t>
+        <w:t>P</w:t>
+      </w:r>
+      <w:r>
+        <w:t>aragraph references</w:t>
       </w:r>
     </w:p>
     <w:p>
@@ -2277,7 +2432,10 @@
         <w:pStyle w:val="ListParagraph"/>
       </w:pPr>
       <w:r>
-        <w:t>policy content</w:t>
+        <w:t>P</w:t>
+      </w:r>
+      <w:r>
+        <w:t>olicy content</w:t>
       </w:r>
     </w:p>
     <w:p>
@@ -2285,7 +2443,36 @@
         <w:pStyle w:val="ListParagraph"/>
       </w:pPr>
       <w:r>
-        <w:t>provenance metadata.</w:t>
+        <w:t>P</w:t>
+      </w:r>
+      <w:r>
+        <w:t>rovenance metadata.</w:t>
+      </w:r>
+    </w:p>
+    <w:p/>
+    <w:p>
+      <w:pPr>
+        <w:rPr>
+          <w:b/>
+          <w:bCs/>
+        </w:rPr>
+      </w:pPr>
+      <w:r>
+        <w:rPr>
+          <w:b/>
+          <w:bCs/>
+        </w:rPr>
+        <w:t>Reproducibility Verification</w:t>
+      </w:r>
+    </w:p>
+    <w:p>
+      <w:r>
+        <w:t>The ingestion and chunking workflow was re-executed from the current Sprint 3 repository on 6 September 2026. All five configured authoritative La Trobe policy sources were successfully retrieved and processed, producing 85 chunks across the five policies.</w:t>
+      </w:r>
+    </w:p>
+    <w:p>
+      <w:r>
+        <w:t>The regenerated chunk outputs matched the committed chunk files, with no chunk-file changes detected by Git. This provides evidence that the documented ingestion and chunking process is reproducible from the current repository state.</w:t>
       </w:r>
     </w:p>
     <w:p/>
@@ -2310,54 +2497,32 @@
     </w:p>
     <w:p>
       <w:r>
-        <w:t>From the Project Lex project directory, ensure the Python virtual environment is active.</w:t>
-      </w:r>
-    </w:p>
+        <w:t xml:space="preserve">From the Project Lex </w:t>
+      </w:r>
+      <w:r>
+        <w:t>repository root</w:t>
+      </w:r>
+      <w:r>
+        <w:t>, ensure the Python virtual environment is active.</w:t>
+      </w:r>
+    </w:p>
+    <w:p/>
     <w:p>
       <w:r>
         <w:t>The terminal should display:</w:t>
       </w:r>
-    </w:p>
-    <w:p/>
-    <w:tbl>
-      <w:tblPr>
-        <w:tblStyle w:val="TableGrid"/>
-        <w:tblW w:w="0" w:type="auto"/>
-        <w:tblLook w:val="04A0" w:firstRow="1" w:lastRow="0" w:firstColumn="1" w:lastColumn="0" w:noHBand="0" w:noVBand="1"/>
-      </w:tblPr>
-      <w:tblGrid>
-        <w:gridCol w:w="2263"/>
-      </w:tblGrid>
-      <w:tr>
-        <w:tc>
-          <w:tcPr>
-            <w:tcW w:w="2263" w:type="dxa"/>
-          </w:tcPr>
-          <w:p>
-            <w:pPr>
-              <w:rPr>
-                <w:sz w:val="8"/>
-                <w:szCs w:val="8"/>
-              </w:rPr>
-            </w:pPr>
-          </w:p>
-          <w:p>
-            <w:r>
-              <w:t>(.venv)</w:t>
-            </w:r>
-          </w:p>
-          <w:p>
-            <w:pPr>
-              <w:rPr>
-                <w:sz w:val="8"/>
-                <w:szCs w:val="8"/>
-              </w:rPr>
-            </w:pPr>
-          </w:p>
-        </w:tc>
-      </w:tr>
-    </w:tbl>
-    <w:p/>
+      <w:r>
+        <w:t xml:space="preserve"> (</w:t>
+      </w:r>
+      <w:proofErr w:type="spellStart"/>
+      <w:r>
+        <w:t>venv</w:t>
+      </w:r>
+      <w:proofErr w:type="spellEnd"/>
+      <w:r>
+        <w:t>)</w:t>
+      </w:r>
+    </w:p>
     <w:p/>
     <w:p>
       <w:pPr>
@@ -2399,21 +2564,27 @@
     </w:p>
     <w:p>
       <w:r>
-        <w:t>python src/policy_processor.py</w:t>
-      </w:r>
+        <w:t xml:space="preserve">python -m </w:t>
+      </w:r>
+      <w:proofErr w:type="spellStart"/>
+      <w:r>
+        <w:t>ingestion.policy_processor</w:t>
+      </w:r>
+      <w:proofErr w:type="spellEnd"/>
     </w:p>
     <w:p/>
     <w:p>
       <w:r>
         <w:t>The terminal should report successful processing of all five policies.</w:t>
       </w:r>
-    </w:p>
-    <w:p/>
-    <w:p>
+      <w:r>
+        <w:t xml:space="preserve"> </w:t>
+      </w:r>
       <w:r>
         <w:t>The resulting policy JSON files are written to:</w:t>
       </w:r>
     </w:p>
+    <w:p/>
     <w:p>
       <w:r>
         <w:t>data/processed/</w:t>
@@ -2444,12 +2615,18 @@
     </w:p>
     <w:p>
       <w:r>
-        <w:t>python src/policy_chunker.py</w:t>
-      </w:r>
-    </w:p>
-    <w:p/>
-    <w:p>
-      <w:r>
+        <w:t xml:space="preserve">python -m </w:t>
+      </w:r>
+      <w:proofErr w:type="spellStart"/>
+      <w:r>
+        <w:t>ingestion.policy_chunker</w:t>
+      </w:r>
+      <w:proofErr w:type="spellEnd"/>
+    </w:p>
+    <w:p/>
+    <w:p>
+      <w:r>
+        <w:lastRenderedPageBreak/>
         <w:t>The terminal should report:</w:t>
       </w:r>
     </w:p>
@@ -2509,10 +2686,10 @@
         <w:t>data/processed/chunks/</w:t>
       </w:r>
     </w:p>
-    <w:p>
-      <w:r>
-        <w:lastRenderedPageBreak/>
-        <w:t>These chunk files are the primary handover artefact for the next stage.</w:t>
+    <w:p/>
+    <w:p>
+      <w:r>
+        <w:t>These chunk files are the primary handover artefact for the downstream embedding, indexing and retrieval components.</w:t>
       </w:r>
     </w:p>
     <w:p/>
@@ -2530,8 +2707,18 @@
           <w:bCs/>
           <w:sz w:val="22"/>
         </w:rPr>
-        <w:t>11. Handover to Embeddings and Qdrant</w:t>
-      </w:r>
+        <w:t xml:space="preserve">11. Handover to Embeddings and </w:t>
+      </w:r>
+      <w:proofErr w:type="spellStart"/>
+      <w:r>
+        <w:rPr>
+          <w:b/>
+          <w:bCs/>
+          <w:sz w:val="22"/>
+        </w:rPr>
+        <w:t>Qdrant</w:t>
+      </w:r>
+      <w:proofErr w:type="spellEnd"/>
     </w:p>
     <w:p>
       <w:r>
@@ -2620,15 +2807,12 @@
     <w:p/>
     <w:p>
       <w:r>
-        <w:t>The next stage begins with the generated chunk JSON files.</w:t>
-      </w:r>
-    </w:p>
-    <w:p>
-      <w:r>
-        <w:t>You</w:t>
-      </w:r>
-      <w:r>
-        <w:t xml:space="preserve"> should not need to retrieve, scrape or clean the original policy webpages again.</w:t>
+        <w:t>The generated chunk JSON files provide the handover point to the downstream embedding, indexing and retrieval components.</w:t>
+      </w:r>
+    </w:p>
+    <w:p>
+      <w:r>
+        <w:t>For normal downstream processing, the original policy webpages do not need to be retrieved or cleaned again. Reprocessing is required where an authoritative source policy has changed, as described in Section 14.</w:t>
       </w:r>
     </w:p>
     <w:p>
@@ -2653,12 +2837,21 @@
           <w:sz w:val="24"/>
           <w:szCs w:val="24"/>
         </w:rPr>
-        <w:t>12. Next Prototype Stage</w:t>
-      </w:r>
-    </w:p>
-    <w:p>
-      <w:r>
-        <w:t>At a high level, the next stage is:</w:t>
+        <w:t xml:space="preserve">12. </w:t>
+      </w:r>
+      <w:r>
+        <w:rPr>
+          <w:b/>
+          <w:bCs/>
+          <w:sz w:val="24"/>
+          <w:szCs w:val="24"/>
+        </w:rPr>
+        <w:t>Downstream Integration</w:t>
+      </w:r>
+    </w:p>
+    <w:p>
+      <w:r>
+        <w:t>The ingestion and chunking outputs are consumed by the Sprint 3 embedding, indexing and retrieval components. The generated chunk JSON files provide the text and metadata required by the downstream pipeline, while responsibility for embedding, vector indexing and retrieval remains outside the ingestion and chunking component.</w:t>
       </w:r>
     </w:p>
     <w:tbl>
@@ -2697,7 +2890,10 @@
               <w:jc w:val="center"/>
             </w:pPr>
             <w:r>
-              <w:t>Read chunk text</w:t>
+              <w:t xml:space="preserve">Extract </w:t>
+            </w:r>
+            <w:r>
+              <w:t>chunk text</w:t>
             </w:r>
           </w:p>
           <w:p>
@@ -2729,15 +2925,26 @@
               <w:jc w:val="center"/>
             </w:pPr>
             <w:r>
-              <w:t>Store vector in Qdrant</w:t>
-            </w:r>
+              <w:t xml:space="preserve">Store vector </w:t>
+            </w:r>
+            <w:r>
+              <w:t xml:space="preserve">+ metadata </w:t>
+            </w:r>
+            <w:r>
+              <w:t xml:space="preserve">in </w:t>
+            </w:r>
+            <w:proofErr w:type="spellStart"/>
+            <w:r>
+              <w:t>Qdrant</w:t>
+            </w:r>
+            <w:proofErr w:type="spellEnd"/>
           </w:p>
           <w:p>
             <w:pPr>
               <w:jc w:val="center"/>
             </w:pPr>
             <w:r>
-              <w:t>+</w:t>
+              <w:sym w:font="Wingdings" w:char="F0E2"/>
             </w:r>
           </w:p>
           <w:p>
@@ -2745,7 +2952,7 @@
               <w:jc w:val="center"/>
             </w:pPr>
             <w:r>
-              <w:t>Store associated metadata</w:t>
+              <w:t>User query</w:t>
             </w:r>
           </w:p>
           <w:p>
@@ -2761,7 +2968,10 @@
               <w:jc w:val="center"/>
             </w:pPr>
             <w:r>
-              <w:t>Natural-language query</w:t>
+              <w:t>G</w:t>
+            </w:r>
+            <w:r>
+              <w:t>enerate query embedding</w:t>
             </w:r>
           </w:p>
           <w:p>
@@ -2777,23 +2987,10 @@
               <w:jc w:val="center"/>
             </w:pPr>
             <w:r>
-              <w:t>Generate query embedding</w:t>
-            </w:r>
-          </w:p>
-          <w:p>
-            <w:pPr>
-              <w:jc w:val="center"/>
-            </w:pPr>
-            <w:r>
-              <w:sym w:font="Wingdings" w:char="F0E2"/>
-            </w:r>
-          </w:p>
-          <w:p>
-            <w:pPr>
-              <w:jc w:val="center"/>
-            </w:pPr>
-            <w:r>
-              <w:t>Search Qdrant</w:t>
+              <w:t>Similarity s</w:t>
+            </w:r>
+            <w:r>
+              <w:t xml:space="preserve">earch </w:t>
             </w:r>
           </w:p>
           <w:p>
@@ -2833,12 +3030,55 @@
     <w:p/>
     <w:p/>
     <w:p/>
-    <w:p/>
-    <w:p/>
-    <w:p/>
-    <w:p>
-      <w:r>
-        <w:t>The Architecture Report contains the detailed rationale for the selected embedding model, vector database and broader RAG architecture.</w:t>
+    <w:p>
+      <w:pPr>
+        <w:rPr>
+          <w:b/>
+          <w:bCs/>
+          <w:sz w:val="24"/>
+          <w:szCs w:val="24"/>
+        </w:rPr>
+      </w:pPr>
+      <w:r>
+        <w:rPr>
+          <w:b/>
+          <w:bCs/>
+          <w:sz w:val="24"/>
+          <w:szCs w:val="24"/>
+        </w:rPr>
+        <w:lastRenderedPageBreak/>
+        <w:t>12.1 Sprint 3 Integration Verification</w:t>
+      </w:r>
+    </w:p>
+    <w:p>
+      <w:r>
+        <w:t xml:space="preserve">The generated chunk files were successfully consumed by the Sprint 3 embedding, indexing and retrieval components. All 85 policy chunks were embedded using BGE-M3 and indexed into the </w:t>
+      </w:r>
+      <w:proofErr w:type="spellStart"/>
+      <w:r>
+        <w:t>latrobe_policy_chunks</w:t>
+      </w:r>
+      <w:proofErr w:type="spellEnd"/>
+      <w:r>
+        <w:t xml:space="preserve"> </w:t>
+      </w:r>
+      <w:proofErr w:type="spellStart"/>
+      <w:r>
+        <w:t>Qdrant</w:t>
+      </w:r>
+      <w:proofErr w:type="spellEnd"/>
+      <w:r>
+        <w:t xml:space="preserve"> collection.</w:t>
+      </w:r>
+    </w:p>
+    <w:p>
+      <w:r>
+        <w:t>Integration verification confirmed that natural-language queries retrieve current policy evidence with policy title, section and authoritative source URL metadata. Unsupported queries return the configured insufficient-evidence fallback rather than unsupported policy information.</w:t>
+      </w:r>
+    </w:p>
+    <w:p>
+      <w:r>
+        <w:t>Detailed embedding and indexing setup is documented in docs/COPL-183_EMBEDDING_AND_INDEXING_SETUP.md. Retrieval implementation and verification are documented in docs/COPL-184_POLICY_RETRIEVAL.md.</w:t>
       </w:r>
     </w:p>
     <w:p/>
@@ -2906,13 +3146,20 @@
     </w:p>
     <w:p>
       <w:r>
-        <w:t>The metadata should remain associated with the corresponding vector in Qdrant.</w:t>
-      </w:r>
-    </w:p>
-    <w:p/>
-    <w:p>
-      <w:r>
-        <w:lastRenderedPageBreak/>
+        <w:t xml:space="preserve">The metadata should remain associated with the corresponding vector in </w:t>
+      </w:r>
+      <w:proofErr w:type="spellStart"/>
+      <w:r>
+        <w:t>Qdrant</w:t>
+      </w:r>
+      <w:proofErr w:type="spellEnd"/>
+      <w:r>
+        <w:t>.</w:t>
+      </w:r>
+    </w:p>
+    <w:p/>
+    <w:p>
+      <w:r>
         <w:t>In particular, retain:</w:t>
       </w:r>
     </w:p>
@@ -2920,25 +3167,31 @@
       <w:pPr>
         <w:pStyle w:val="ListParagraph"/>
       </w:pPr>
+      <w:proofErr w:type="spellStart"/>
       <w:r>
         <w:t>chunk_id</w:t>
       </w:r>
+      <w:proofErr w:type="spellEnd"/>
     </w:p>
     <w:p>
       <w:pPr>
         <w:pStyle w:val="ListParagraph"/>
       </w:pPr>
+      <w:proofErr w:type="spellStart"/>
       <w:r>
         <w:t>document_id</w:t>
       </w:r>
+      <w:proofErr w:type="spellEnd"/>
     </w:p>
     <w:p>
       <w:pPr>
         <w:pStyle w:val="ListParagraph"/>
       </w:pPr>
+      <w:proofErr w:type="spellStart"/>
       <w:r>
         <w:t>policy_title</w:t>
       </w:r>
+      <w:proofErr w:type="spellEnd"/>
     </w:p>
     <w:p>
       <w:pPr>
@@ -2976,25 +3229,31 @@
       <w:pPr>
         <w:pStyle w:val="ListParagraph"/>
       </w:pPr>
+      <w:proofErr w:type="spellStart"/>
       <w:r>
         <w:t>paragraph_start</w:t>
       </w:r>
+      <w:proofErr w:type="spellEnd"/>
     </w:p>
     <w:p>
       <w:pPr>
         <w:pStyle w:val="ListParagraph"/>
       </w:pPr>
+      <w:proofErr w:type="spellStart"/>
       <w:r>
         <w:t>paragraph_end</w:t>
       </w:r>
+      <w:proofErr w:type="spellEnd"/>
     </w:p>
     <w:p>
       <w:pPr>
         <w:pStyle w:val="ListParagraph"/>
       </w:pPr>
+      <w:proofErr w:type="spellStart"/>
       <w:r>
         <w:t>source_url</w:t>
       </w:r>
+      <w:proofErr w:type="spellEnd"/>
     </w:p>
     <w:p>
       <w:pPr>
@@ -3037,10 +3296,7 @@
         <w:t xml:space="preserve">A successful retrieval should be capable of identifying evidence </w:t>
       </w:r>
       <w:r>
-        <w:t>rather than merely returning an unattributed piece of text</w:t>
-      </w:r>
-      <w:r>
-        <w:t xml:space="preserve"> </w:t>
+        <w:t xml:space="preserve">rather than merely returning an unattributed piece of text </w:t>
       </w:r>
       <w:r>
         <w:t>as follows</w:t>
@@ -3228,6 +3484,7 @@
     </w:p>
     <w:p>
       <w:r>
+        <w:lastRenderedPageBreak/>
         <w:t>Where an authoritative version cannot be established, the value remains null.</w:t>
       </w:r>
     </w:p>
@@ -3254,7 +3511,15 @@
     </w:p>
     <w:p>
       <w:r>
-        <w:t>Before implementing fields such as "students" or "academic_staff", the team should determine a reliable classification method rather than inferring applicability without validation.</w:t>
+        <w:t>Before implementing fields such as "students" or "</w:t>
+      </w:r>
+      <w:proofErr w:type="spellStart"/>
+      <w:r>
+        <w:t>academic_staff</w:t>
+      </w:r>
+      <w:proofErr w:type="spellEnd"/>
+      <w:r>
+        <w:t>", the team should determine a reliable classification method rather than inferring applicability without validation.</w:t>
       </w:r>
     </w:p>
     <w:p/>
@@ -3296,20 +3561,21 @@
     </w:p>
     <w:p>
       <w:r>
-        <w:t>The Sprint 3 prototype does not yet automatically detect policy changes. During the prototype stage, where a selected source policy has changed, refresh the Project Lex policy data by:</w:t>
-      </w:r>
-    </w:p>
-    <w:p/>
+        <w:t>The Sprint 3 prototype does not yet automatically detect policy changes. Where a configured source policy has changed, refresh the Project Lex policy data as follows:</w:t>
+      </w:r>
+    </w:p>
     <w:p>
       <w:pPr>
         <w:pStyle w:val="ListParagraph"/>
         <w:numPr>
           <w:ilvl w:val="0"/>
-          <w:numId w:val="10"/>
+          <w:numId w:val="11"/>
         </w:numPr>
-      </w:pPr>
-      <w:r>
-        <w:t>Confirm that the configured URL points to the current authoritative La Trobe policy.</w:t>
+        <w:spacing w:before="120" w:after="120"/>
+        <w:ind w:left="714" w:hanging="357"/>
+      </w:pPr>
+      <w:r>
+        <w:t>Confirm that the configured URL points to the current authoritative La Trobe policy source.</w:t>
       </w:r>
     </w:p>
     <w:p>
@@ -3317,11 +3583,21 @@
         <w:pStyle w:val="ListParagraph"/>
         <w:numPr>
           <w:ilvl w:val="0"/>
-          <w:numId w:val="10"/>
+          <w:numId w:val="11"/>
         </w:numPr>
-      </w:pPr>
-      <w:r>
-        <w:t>Run python src/policy_processor.py to retrieve and regenerate the processed policy JSON.</w:t>
+        <w:spacing w:before="120" w:after="120"/>
+        <w:ind w:left="714" w:hanging="357"/>
+      </w:pPr>
+      <w:r>
+        <w:t xml:space="preserve">From the repository root with the Python virtual environment active, run python -m </w:t>
+      </w:r>
+      <w:proofErr w:type="spellStart"/>
+      <w:r>
+        <w:t>ingestion.policy_processor</w:t>
+      </w:r>
+      <w:proofErr w:type="spellEnd"/>
+      <w:r>
+        <w:t xml:space="preserve"> to retrieve and regenerate the processed policy JSON.</w:t>
       </w:r>
     </w:p>
     <w:p>
@@ -3329,12 +3605,21 @@
         <w:pStyle w:val="ListParagraph"/>
         <w:numPr>
           <w:ilvl w:val="0"/>
-          <w:numId w:val="10"/>
+          <w:numId w:val="11"/>
         </w:numPr>
-      </w:pPr>
-      <w:r>
-        <w:lastRenderedPageBreak/>
-        <w:t>Run python src/policy_chunker.py to regenerate the corresponding structured chunks.</w:t>
+        <w:spacing w:before="120" w:after="120"/>
+        <w:ind w:left="714" w:hanging="357"/>
+      </w:pPr>
+      <w:r>
+        <w:t xml:space="preserve">Run python -m </w:t>
+      </w:r>
+      <w:proofErr w:type="spellStart"/>
+      <w:r>
+        <w:t>ingestion.policy_chunker</w:t>
+      </w:r>
+      <w:proofErr w:type="spellEnd"/>
+      <w:r>
+        <w:t xml:space="preserve"> to regenerate the hierarchical chunk files in data/processed/chunks/.</w:t>
       </w:r>
     </w:p>
     <w:p>
@@ -3342,11 +3627,13 @@
         <w:pStyle w:val="ListParagraph"/>
         <w:numPr>
           <w:ilvl w:val="0"/>
-          <w:numId w:val="10"/>
+          <w:numId w:val="11"/>
         </w:numPr>
-      </w:pPr>
-      <w:r>
-        <w:t>Confirm the policy status/currency metadata and inspect representative chunks.</w:t>
+        <w:spacing w:before="120" w:after="120"/>
+        <w:ind w:left="714" w:hanging="357"/>
+      </w:pPr>
+      <w:r>
+        <w:t>Validate the regenerated policy and chunk outputs, including the policy content, source URL, status and available effective-date/version metadata.</w:t>
       </w:r>
     </w:p>
     <w:p>
@@ -3354,20 +3641,114 @@
         <w:pStyle w:val="ListParagraph"/>
         <w:numPr>
           <w:ilvl w:val="0"/>
-          <w:numId w:val="10"/>
+          <w:numId w:val="11"/>
         </w:numPr>
-      </w:pPr>
-      <w:r>
-        <w:t>The updated chunk output can then be re-embedded and the corresponding records in the vector database updated.</w:t>
-      </w:r>
-    </w:p>
-    <w:p/>
-    <w:p>
-      <w:r>
-        <w:t>Automated discovery and change detection across the wider La Trobe Policy Library is a future-state capability and is not implemented in the Sprint 3 prototype</w:t>
-      </w:r>
-      <w:r>
-        <w:t>.</w:t>
+        <w:spacing w:before="120" w:after="120"/>
+        <w:ind w:left="714" w:hanging="357"/>
+      </w:pPr>
+      <w:r>
+        <w:t xml:space="preserve">Where a policy has changed, replace that document’s existing </w:t>
+      </w:r>
+      <w:proofErr w:type="spellStart"/>
+      <w:r>
+        <w:t>Qdrant</w:t>
+      </w:r>
+      <w:proofErr w:type="spellEnd"/>
+      <w:r>
+        <w:t xml:space="preserve"> points and re-index the regenerated chunk file so that obsolete chunks do not remain in the vector store.</w:t>
+      </w:r>
+    </w:p>
+    <w:p>
+      <w:pPr>
+        <w:pStyle w:val="ListParagraph"/>
+        <w:numPr>
+          <w:ilvl w:val="0"/>
+          <w:numId w:val="11"/>
+        </w:numPr>
+        <w:spacing w:before="120" w:after="120"/>
+        <w:ind w:left="714" w:hanging="357"/>
+      </w:pPr>
+      <w:r>
+        <w:t>Verify retrieval after re-indexing to confirm that the updated policy can be retrieved and that the returned evidence retains the expected policy title, section and authoritative source URL.</w:t>
+      </w:r>
+    </w:p>
+    <w:p/>
+    <w:p>
+      <w:r>
+        <w:t>The implemented single-policy replacement command is:</w:t>
+      </w:r>
+    </w:p>
+    <w:p>
+      <w:r>
+        <w:t xml:space="preserve">python -m </w:t>
+      </w:r>
+      <w:proofErr w:type="spellStart"/>
+      <w:r>
+        <w:t>ingestion.qdrant_indexer</w:t>
+      </w:r>
+      <w:proofErr w:type="spellEnd"/>
+      <w:r>
+        <w:t xml:space="preserve"> --replace-document &lt;</w:t>
+      </w:r>
+      <w:proofErr w:type="spellStart"/>
+      <w:r>
+        <w:t>document_id</w:t>
+      </w:r>
+      <w:proofErr w:type="spellEnd"/>
+      <w:r>
+        <w:t>&gt; --file &lt;</w:t>
+      </w:r>
+      <w:proofErr w:type="spellStart"/>
+      <w:r>
+        <w:t>chunk_file</w:t>
+      </w:r>
+      <w:proofErr w:type="spellEnd"/>
+      <w:r>
+        <w:t>&gt;</w:t>
+      </w:r>
+    </w:p>
+    <w:p/>
+    <w:p>
+      <w:r>
+        <w:t>Example:</w:t>
+      </w:r>
+    </w:p>
+    <w:p>
+      <w:r>
+        <w:t xml:space="preserve">python -m </w:t>
+      </w:r>
+      <w:proofErr w:type="spellStart"/>
+      <w:r>
+        <w:t>ingestion.qdrant_indexer</w:t>
+      </w:r>
+      <w:proofErr w:type="spellEnd"/>
+      <w:r>
+        <w:t xml:space="preserve"> --replace-document 216 --file </w:t>
+      </w:r>
+      <w:proofErr w:type="spellStart"/>
+      <w:r>
+        <w:t>assessment_policy_chunks.json</w:t>
+      </w:r>
+      <w:proofErr w:type="spellEnd"/>
+    </w:p>
+    <w:p/>
+    <w:p>
+      <w:r>
+        <w:t xml:space="preserve">Detailed </w:t>
+      </w:r>
+      <w:proofErr w:type="spellStart"/>
+      <w:r>
+        <w:t>Qdrant</w:t>
+      </w:r>
+      <w:proofErr w:type="spellEnd"/>
+      <w:r>
+        <w:t xml:space="preserve"> replacement and re-indexing instructions are documented in docs/COPL-183_EMBEDDING_AND_INDEXING_SETUP.md.</w:t>
+      </w:r>
+    </w:p>
+    <w:p/>
+    <w:p>
+      <w:r>
+        <w:t>Automatic policy discovery, change detection and scheduled re-indexing across the wider La Trobe Policy Library are not implemented in the current prototype. The Sprint 3 implementation provides a reproducible manual refresh and replacement process.</w:t>
       </w:r>
     </w:p>
     <w:p/>
@@ -3482,19 +3863,25 @@
     <w:p/>
     <w:p>
       <w:r>
-        <w:t>The next development stage can therefore start from the generated chunk files rather than the original webpages.</w:t>
-      </w:r>
-    </w:p>
-    <w:p/>
-    <w:p>
-      <w:r>
-        <w:t>The immediate objective is to</w:t>
-      </w:r>
-      <w:r>
-        <w:t xml:space="preserve"> g</w:t>
-      </w:r>
-      <w:r>
-        <w:t>enerate embeddings for the chunk text, store the vectors and associated metadata in Qdrant, and demonstrate that a natural-language query retrieves the correct policy evidence.</w:t>
+        <w:t xml:space="preserve">The generated chunk files now provide the handover point to the implemented Sprint 3 embedding, indexing and retrieval components. All 85 generated policy chunks have been successfully embedded using BGE-M3 and indexed in </w:t>
+      </w:r>
+      <w:proofErr w:type="spellStart"/>
+      <w:r>
+        <w:t>Qdrant</w:t>
+      </w:r>
+      <w:proofErr w:type="spellEnd"/>
+      <w:r>
+        <w:t xml:space="preserve"> while retaining the metadata required to support traceability to the authoritative policy source.</w:t>
+      </w:r>
+    </w:p>
+    <w:p/>
+    <w:p>
+      <w:r>
+        <w:t xml:space="preserve">Sprint 3 integration verification demonstrated that natural-language queries can retrieve current policy evidence containing the policy title, section and authoritative source URL. Unsupported queries return </w:t>
+      </w:r>
+      <w:r>
+        <w:lastRenderedPageBreak/>
+        <w:t>an insufficient-evidence fallback rather than unsupported policy information. This confirms that the ingestion and chunking outputs can be successfully consumed by the downstream retrieval pipeline.</w:t>
       </w:r>
     </w:p>
     <w:p/>
@@ -3514,8 +3901,94 @@
 </file>
 
 <file path=word/numbering.xml><?xml version="1.0" encoding="utf-8"?>
-<w:numbering xmlns:wpc="http://schemas.microsoft.com/office/word/2010/wordprocessingCanvas" xmlns:cx="http://schemas.microsoft.com/office/drawing/2014/chartex" xmlns:cx1="http://schemas.microsoft.com/office/drawing/2015/9/8/chartex" xmlns:cx2="http://schemas.microsoft.com/office/drawing/2015/10/21/chartex" xmlns:cx3="http://schemas.microsoft.com/office/drawing/2016/5/9/chartex" xmlns:cx4="http://schemas.microsoft.com/office/drawing/2016/5/10/chartex" xmlns:cx5="http://schemas.microsoft.com/office/drawing/2016/5/11/chartex" xmlns:cx6="http://schemas.microsoft.com/office/drawing/2016/5/12/chartex" xmlns:cx7="http://schemas.microsoft.com/office/drawing/2016/5/13/chartex" xmlns:cx8="http://schemas.microsoft.com/office/drawing/2016/5/14/chartex" xmlns:mc="http://schemas.openxmlformats.org/markup-compatibility/2006" xmlns:aink="http://schemas.microsoft.com/office/drawing/2016/ink" xmlns:am3d="http://schemas.microsoft.com/office/drawing/2017/model3d" xmlns:o="urn:schemas-microsoft-com:office:office" xmlns:oel="http://schemas.microsoft.com/office/2019/extlst" xmlns:r="http://schemas.openxmlformats.org/officeDocument/2006/relationships" xmlns:m="http://schemas.openxmlformats.org/officeDocument/2006/math" xmlns:v="urn:schemas-microsoft-com:vml" xmlns:wp14="http://schemas.microsoft.com/office/word/2010/wordprocessingDrawing" xmlns:wp="http://schemas.openxmlformats.org/drawingml/2006/wordprocessingDrawing" xmlns:w10="urn:schemas-microsoft-com:office:word" xmlns:w="http://schemas.openxmlformats.org/wordprocessingml/2006/main" xmlns:w14="http://schemas.microsoft.com/office/word/2010/wordml" xmlns:w15="http://schemas.microsoft.com/office/word/2012/wordml" xmlns:w16cei="http://schemas.microsoft.com/office/word/2026/wordml/cei" xmlns:w16cex="http://schemas.microsoft.com/office/word/2018/wordml/cex" xmlns:w16cid="http://schemas.microsoft.com/office/word/2016/wordml/cid" xmlns:w16="http://schemas.microsoft.com/office/word/2018/wordml" xmlns:w16du="http://schemas.microsoft.com/office/word/2023/wordml/word16du" xmlns:w16sdtdh="http://schemas.microsoft.com/office/word/2020/wordml/sdtdatahash" xmlns:w16sdtfl="http://schemas.microsoft.com/office/word/2024/wordml/sdtformatlock" xmlns:w16se="http://schemas.microsoft.com/office/word/2015/wordml/symex" xmlns:wpg="http://schemas.microsoft.com/office/word/2010/wordprocessingGroup" xmlns:wpi="http://schemas.microsoft.com/office/word/2010/wordprocessingInk" xmlns:wne="http://schemas.microsoft.com/office/word/2006/wordml" xmlns:wps="http://schemas.microsoft.com/office/word/2010/wordprocessingShape" mc:Ignorable="w14 w15 w16se w16cid w16 w16cex w16sdtdh w16sdtfl w16du wp14">
+<w:numbering xmlns:wpc="http://schemas.microsoft.com/office/word/2010/wordprocessingCanvas" xmlns:cx="http://schemas.microsoft.com/office/drawing/2014/chartex" xmlns:cx1="http://schemas.microsoft.com/office/drawing/2015/9/8/chartex" xmlns:cx2="http://schemas.microsoft.com/office/drawing/2015/10/21/chartex" xmlns:cx3="http://schemas.microsoft.com/office/drawing/2016/5/9/chartex" xmlns:cx4="http://schemas.microsoft.com/office/drawing/2016/5/10/chartex" xmlns:cx5="http://schemas.microsoft.com/office/drawing/2016/5/11/chartex" xmlns:cx6="http://schemas.microsoft.com/office/drawing/2016/5/12/chartex" xmlns:cx7="http://schemas.microsoft.com/office/drawing/2016/5/13/chartex" xmlns:cx8="http://schemas.microsoft.com/office/drawing/2016/5/14/chartex" xmlns:mc="http://schemas.openxmlformats.org/markup-compatibility/2006" xmlns:aink="http://schemas.microsoft.com/office/drawing/2016/ink" xmlns:am3d="http://schemas.microsoft.com/office/drawing/2017/model3d" xmlns:o="urn:schemas-microsoft-com:office:office" xmlns:oel="http://schemas.microsoft.com/office/2019/extlst" xmlns:r="http://schemas.openxmlformats.org/officeDocument/2006/relationships" xmlns:m="http://schemas.openxmlformats.org/officeDocument/2006/math" xmlns:v="urn:schemas-microsoft-com:vml" xmlns:wp14="http://schemas.microsoft.com/office/word/2010/wordprocessingDrawing" xmlns:wp="http://schemas.openxmlformats.org/drawingml/2006/wordprocessingDrawing" xmlns:w10="urn:schemas-microsoft-com:office:word" xmlns:w="http://schemas.openxmlformats.org/wordprocessingml/2006/main" xmlns:w14="http://schemas.microsoft.com/office/word/2010/wordml" xmlns:w15="http://schemas.microsoft.com/office/word/2012/wordml" xmlns:w16cex="http://schemas.microsoft.com/office/word/2018/wordml/cex" xmlns:w16cid="http://schemas.microsoft.com/office/word/2016/wordml/cid" xmlns:w16="http://schemas.microsoft.com/office/word/2018/wordml" xmlns:w16du="http://schemas.microsoft.com/office/word/2023/wordml/word16du" xmlns:w16sdtdh="http://schemas.microsoft.com/office/word/2020/wordml/sdtdatahash" xmlns:w16sdtfl="http://schemas.microsoft.com/office/word/2024/wordml/sdtformatlock" xmlns:w16se="http://schemas.microsoft.com/office/word/2015/wordml/symex" xmlns:wpg="http://schemas.microsoft.com/office/word/2010/wordprocessingGroup" xmlns:wpi="http://schemas.microsoft.com/office/word/2010/wordprocessingInk" xmlns:wne="http://schemas.microsoft.com/office/word/2006/wordml" xmlns:wps="http://schemas.microsoft.com/office/word/2010/wordprocessingShape" mc:Ignorable="w14 w15 w16se w16cid w16 w16cex w16sdtdh w16sdtfl w16du wp14">
   <w:abstractNum w:abstractNumId="0" w15:restartNumberingAfterBreak="0">
+    <w:nsid w:val="11F62D42"/>
+    <w:multiLevelType w:val="hybridMultilevel"/>
+    <w:tmpl w:val="D5BE885E"/>
+    <w:lvl w:ilvl="0" w:tplc="0C09000F">
+      <w:start w:val="1"/>
+      <w:numFmt w:val="decimal"/>
+      <w:lvlText w:val="%1."/>
+      <w:lvlJc w:val="left"/>
+      <w:pPr>
+        <w:ind w:left="720" w:hanging="360"/>
+      </w:pPr>
+    </w:lvl>
+    <w:lvl w:ilvl="1" w:tplc="0C090019" w:tentative="1">
+      <w:start w:val="1"/>
+      <w:numFmt w:val="lowerLetter"/>
+      <w:lvlText w:val="%2."/>
+      <w:lvlJc w:val="left"/>
+      <w:pPr>
+        <w:ind w:left="1440" w:hanging="360"/>
+      </w:pPr>
+    </w:lvl>
+    <w:lvl w:ilvl="2" w:tplc="0C09001B" w:tentative="1">
+      <w:start w:val="1"/>
+      <w:numFmt w:val="lowerRoman"/>
+      <w:lvlText w:val="%3."/>
+      <w:lvlJc w:val="right"/>
+      <w:pPr>
+        <w:ind w:left="2160" w:hanging="180"/>
+      </w:pPr>
+    </w:lvl>
+    <w:lvl w:ilvl="3" w:tplc="0C09000F" w:tentative="1">
+      <w:start w:val="1"/>
+      <w:numFmt w:val="decimal"/>
+      <w:lvlText w:val="%4."/>
+      <w:lvlJc w:val="left"/>
+      <w:pPr>
+        <w:ind w:left="2880" w:hanging="360"/>
+      </w:pPr>
+    </w:lvl>
+    <w:lvl w:ilvl="4" w:tplc="0C090019" w:tentative="1">
+      <w:start w:val="1"/>
+      <w:numFmt w:val="lowerLetter"/>
+      <w:lvlText w:val="%5."/>
+      <w:lvlJc w:val="left"/>
+      <w:pPr>
+        <w:ind w:left="3600" w:hanging="360"/>
+      </w:pPr>
+    </w:lvl>
+    <w:lvl w:ilvl="5" w:tplc="0C09001B" w:tentative="1">
+      <w:start w:val="1"/>
+      <w:numFmt w:val="lowerRoman"/>
+      <w:lvlText w:val="%6."/>
+      <w:lvlJc w:val="right"/>
+      <w:pPr>
+        <w:ind w:left="4320" w:hanging="180"/>
+      </w:pPr>
+    </w:lvl>
+    <w:lvl w:ilvl="6" w:tplc="0C09000F" w:tentative="1">
+      <w:start w:val="1"/>
+      <w:numFmt w:val="decimal"/>
+      <w:lvlText w:val="%7."/>
+      <w:lvlJc w:val="left"/>
+      <w:pPr>
+        <w:ind w:left="5040" w:hanging="360"/>
+      </w:pPr>
+    </w:lvl>
+    <w:lvl w:ilvl="7" w:tplc="0C090019" w:tentative="1">
+      <w:start w:val="1"/>
+      <w:numFmt w:val="lowerLetter"/>
+      <w:lvlText w:val="%8."/>
+      <w:lvlJc w:val="left"/>
+      <w:pPr>
+        <w:ind w:left="5760" w:hanging="360"/>
+      </w:pPr>
+    </w:lvl>
+    <w:lvl w:ilvl="8" w:tplc="0C09001B" w:tentative="1">
+      <w:start w:val="1"/>
+      <w:numFmt w:val="lowerRoman"/>
+      <w:lvlText w:val="%9."/>
+      <w:lvlJc w:val="right"/>
+      <w:pPr>
+        <w:ind w:left="6480" w:hanging="180"/>
+      </w:pPr>
+    </w:lvl>
+  </w:abstractNum>
+  <w:abstractNum w:abstractNumId="1" w15:restartNumberingAfterBreak="0">
     <w:nsid w:val="16D10905"/>
     <w:multiLevelType w:val="hybridMultilevel"/>
     <w:tmpl w:val="7CD2F2AC"/>
@@ -3601,7 +4074,7 @@
       </w:pPr>
     </w:lvl>
   </w:abstractNum>
-  <w:abstractNum w:abstractNumId="1" w15:restartNumberingAfterBreak="0">
+  <w:abstractNum w:abstractNumId="2" w15:restartNumberingAfterBreak="0">
     <w:nsid w:val="20784D5D"/>
     <w:multiLevelType w:val="hybridMultilevel"/>
     <w:tmpl w:val="7AC2DE7A"/>
@@ -3714,7 +4187,7 @@
       </w:rPr>
     </w:lvl>
   </w:abstractNum>
-  <w:abstractNum w:abstractNumId="2" w15:restartNumberingAfterBreak="0">
+  <w:abstractNum w:abstractNumId="3" w15:restartNumberingAfterBreak="0">
     <w:nsid w:val="319A156B"/>
     <w:multiLevelType w:val="hybridMultilevel"/>
     <w:tmpl w:val="BDECBC78"/>
@@ -3827,7 +4300,7 @@
       </w:rPr>
     </w:lvl>
   </w:abstractNum>
-  <w:abstractNum w:abstractNumId="3" w15:restartNumberingAfterBreak="0">
+  <w:abstractNum w:abstractNumId="4" w15:restartNumberingAfterBreak="0">
     <w:nsid w:val="48034E79"/>
     <w:multiLevelType w:val="hybridMultilevel"/>
     <w:tmpl w:val="D508461A"/>
@@ -3941,7 +4414,7 @@
       </w:rPr>
     </w:lvl>
   </w:abstractNum>
-  <w:abstractNum w:abstractNumId="4" w15:restartNumberingAfterBreak="0">
+  <w:abstractNum w:abstractNumId="5" w15:restartNumberingAfterBreak="0">
     <w:nsid w:val="527B07EE"/>
     <w:multiLevelType w:val="hybridMultilevel"/>
     <w:tmpl w:val="D9AA11F4"/>
@@ -4054,7 +4527,7 @@
       </w:rPr>
     </w:lvl>
   </w:abstractNum>
-  <w:abstractNum w:abstractNumId="5" w15:restartNumberingAfterBreak="0">
+  <w:abstractNum w:abstractNumId="6" w15:restartNumberingAfterBreak="0">
     <w:nsid w:val="5BC02A4B"/>
     <w:multiLevelType w:val="hybridMultilevel"/>
     <w:tmpl w:val="7BDE6978"/>
@@ -4140,7 +4613,7 @@
       </w:pPr>
     </w:lvl>
   </w:abstractNum>
-  <w:abstractNum w:abstractNumId="6" w15:restartNumberingAfterBreak="0">
+  <w:abstractNum w:abstractNumId="7" w15:restartNumberingAfterBreak="0">
     <w:nsid w:val="5C1977A1"/>
     <w:multiLevelType w:val="hybridMultilevel"/>
     <w:tmpl w:val="3E4448D8"/>
@@ -4253,7 +4726,7 @@
       </w:rPr>
     </w:lvl>
   </w:abstractNum>
-  <w:abstractNum w:abstractNumId="7" w15:restartNumberingAfterBreak="0">
+  <w:abstractNum w:abstractNumId="8" w15:restartNumberingAfterBreak="0">
     <w:nsid w:val="784A7E2A"/>
     <w:multiLevelType w:val="hybridMultilevel"/>
     <w:tmpl w:val="A976B446"/>
@@ -4367,33 +4840,36 @@
     </w:lvl>
   </w:abstractNum>
   <w:num w:numId="1" w16cid:durableId="1781489550">
+    <w:abstractNumId w:val="2"/>
+  </w:num>
+  <w:num w:numId="2" w16cid:durableId="900559728">
+    <w:abstractNumId w:val="5"/>
+  </w:num>
+  <w:num w:numId="3" w16cid:durableId="565456898">
+    <w:abstractNumId w:val="8"/>
+  </w:num>
+  <w:num w:numId="4" w16cid:durableId="1362198147">
+    <w:abstractNumId w:val="3"/>
+  </w:num>
+  <w:num w:numId="5" w16cid:durableId="1981839123">
+    <w:abstractNumId w:val="7"/>
+  </w:num>
+  <w:num w:numId="6" w16cid:durableId="1287467776">
+    <w:abstractNumId w:val="4"/>
+  </w:num>
+  <w:num w:numId="7" w16cid:durableId="1439914031">
+    <w:abstractNumId w:val="6"/>
+  </w:num>
+  <w:num w:numId="8" w16cid:durableId="438961678">
+    <w:abstractNumId w:val="4"/>
+  </w:num>
+  <w:num w:numId="9" w16cid:durableId="401412796">
+    <w:abstractNumId w:val="4"/>
+  </w:num>
+  <w:num w:numId="10" w16cid:durableId="1407608068">
     <w:abstractNumId w:val="1"/>
   </w:num>
-  <w:num w:numId="2" w16cid:durableId="900559728">
-    <w:abstractNumId w:val="4"/>
-  </w:num>
-  <w:num w:numId="3" w16cid:durableId="565456898">
-    <w:abstractNumId w:val="7"/>
-  </w:num>
-  <w:num w:numId="4" w16cid:durableId="1362198147">
-    <w:abstractNumId w:val="2"/>
-  </w:num>
-  <w:num w:numId="5" w16cid:durableId="1981839123">
-    <w:abstractNumId w:val="6"/>
-  </w:num>
-  <w:num w:numId="6" w16cid:durableId="1287467776">
-    <w:abstractNumId w:val="3"/>
-  </w:num>
-  <w:num w:numId="7" w16cid:durableId="1439914031">
-    <w:abstractNumId w:val="5"/>
-  </w:num>
-  <w:num w:numId="8" w16cid:durableId="438961678">
-    <w:abstractNumId w:val="3"/>
-  </w:num>
-  <w:num w:numId="9" w16cid:durableId="401412796">
-    <w:abstractNumId w:val="3"/>
-  </w:num>
-  <w:num w:numId="10" w16cid:durableId="1407608068">
+  <w:num w:numId="11" w16cid:durableId="325205443">
     <w:abstractNumId w:val="0"/>
   </w:num>
 </w:numbering>
@@ -5012,6 +5488,7 @@
   <w:style w:type="character" w:default="1" w:styleId="DefaultParagraphFont">
     <w:name w:val="Default Paragraph Font"/>
     <w:uiPriority w:val="1"/>
+    <w:semiHidden/>
     <w:unhideWhenUsed/>
   </w:style>
   <w:style w:type="table" w:default="1" w:styleId="TableNormal">
@@ -5382,6 +5859,22 @@
       </w:tblBorders>
     </w:tblPr>
   </w:style>
+  <w:style w:type="paragraph" w:styleId="Revision">
+    <w:name w:val="Revision"/>
+    <w:hidden/>
+    <w:uiPriority w:val="99"/>
+    <w:semiHidden/>
+    <w:rsid w:val="0059061C"/>
+    <w:pPr>
+      <w:spacing w:after="0" w:line="240" w:lineRule="auto"/>
+    </w:pPr>
+    <w:rPr>
+      <w:rFonts w:ascii="Arial" w:hAnsi="Arial"/>
+      <w:kern w:val="0"/>
+      <w:sz w:val="20"/>
+      <w14:ligatures w14:val="none"/>
+    </w:rPr>
+  </w:style>
 </w:styles>
 </file>
 
@@ -5678,4 +6171,243 @@
     </a:ext>
   </a:extLst>
 </a:theme>
+</file>
+
+<file path=customXml/item1.xml><?xml version="1.0" encoding="utf-8"?>
+<ct:contentTypeSchema xmlns:ct="http://schemas.microsoft.com/office/2006/metadata/contentType" xmlns:ma="http://schemas.microsoft.com/office/2006/metadata/properties/metaAttributes" ct:_="" ma:_="" ma:contentTypeName="Document" ma:contentTypeID="0x010100F5E321B7EB4B2E44ABC64FCBAC98D008" ma:contentTypeVersion="10" ma:contentTypeDescription="Create a new document." ma:contentTypeScope="" ma:versionID="b716a09049af3a17a29af93a90e1cedc">
+  <xsd:schema xmlns:xsd="http://www.w3.org/2001/XMLSchema" xmlns:xs="http://www.w3.org/2001/XMLSchema" xmlns:p="http://schemas.microsoft.com/office/2006/metadata/properties" xmlns:ns2="0fb7d555-d2b2-4203-9588-53beb96c1c76" targetNamespace="http://schemas.microsoft.com/office/2006/metadata/properties" ma:root="true" ma:fieldsID="93e73dbe61ce31f1c523d542a2f0ad49" ns2:_="">
+    <xsd:import namespace="0fb7d555-d2b2-4203-9588-53beb96c1c76"/>
+    <xsd:element name="properties">
+      <xsd:complexType>
+        <xsd:sequence>
+          <xsd:element name="documentManagement">
+            <xsd:complexType>
+              <xsd:all>
+                <xsd:element ref="ns2:MediaServiceMetadata" minOccurs="0"/>
+                <xsd:element ref="ns2:MediaServiceFastMetadata" minOccurs="0"/>
+                <xsd:element ref="ns2:MediaServiceSearchProperties" minOccurs="0"/>
+                <xsd:element ref="ns2:MediaServiceDateTaken" minOccurs="0"/>
+                <xsd:element ref="ns2:MediaServiceGenerationTime" minOccurs="0"/>
+                <xsd:element ref="ns2:MediaServiceEventHashCode" minOccurs="0"/>
+                <xsd:element ref="ns2:MediaLengthInSeconds" minOccurs="0"/>
+                <xsd:element ref="ns2:lcf76f155ced4ddcb4097134ff3c332f" minOccurs="0"/>
+                <xsd:element ref="ns2:MediaServiceOCR" minOccurs="0"/>
+              </xsd:all>
+            </xsd:complexType>
+          </xsd:element>
+        </xsd:sequence>
+      </xsd:complexType>
+    </xsd:element>
+  </xsd:schema>
+  <xsd:schema xmlns:xsd="http://www.w3.org/2001/XMLSchema" xmlns:xs="http://www.w3.org/2001/XMLSchema" xmlns:dms="http://schemas.microsoft.com/office/2006/documentManagement/types" xmlns:pc="http://schemas.microsoft.com/office/infopath/2007/PartnerControls" targetNamespace="0fb7d555-d2b2-4203-9588-53beb96c1c76" elementFormDefault="qualified">
+    <xsd:import namespace="http://schemas.microsoft.com/office/2006/documentManagement/types"/>
+    <xsd:import namespace="http://schemas.microsoft.com/office/infopath/2007/PartnerControls"/>
+    <xsd:element name="MediaServiceMetadata" ma:index="8" nillable="true" ma:displayName="MediaServiceMetadata" ma:hidden="true" ma:internalName="MediaServiceMetadata" ma:readOnly="true">
+      <xsd:simpleType>
+        <xsd:restriction base="dms:Note"/>
+      </xsd:simpleType>
+    </xsd:element>
+    <xsd:element name="MediaServiceFastMetadata" ma:index="9" nillable="true" ma:displayName="MediaServiceFastMetadata" ma:hidden="true" ma:internalName="MediaServiceFastMetadata" ma:readOnly="true">
+      <xsd:simpleType>
+        <xsd:restriction base="dms:Note"/>
+      </xsd:simpleType>
+    </xsd:element>
+    <xsd:element name="MediaServiceSearchProperties" ma:index="10" nillable="true" ma:displayName="MediaServiceSearchProperties" ma:hidden="true" ma:internalName="MediaServiceSearchProperties" ma:readOnly="true">
+      <xsd:simpleType>
+        <xsd:restriction base="dms:Note"/>
+      </xsd:simpleType>
+    </xsd:element>
+    <xsd:element name="MediaServiceDateTaken" ma:index="11" nillable="true" ma:displayName="MediaServiceDateTaken" ma:hidden="true" ma:indexed="true" ma:internalName="MediaServiceDateTaken" ma:readOnly="true">
+      <xsd:simpleType>
+        <xsd:restriction base="dms:Text"/>
+      </xsd:simpleType>
+    </xsd:element>
+    <xsd:element name="MediaServiceGenerationTime" ma:index="12" nillable="true" ma:displayName="MediaServiceGenerationTime" ma:hidden="true" ma:internalName="MediaServiceGenerationTime" ma:readOnly="true">
+      <xsd:simpleType>
+        <xsd:restriction base="dms:Text"/>
+      </xsd:simpleType>
+    </xsd:element>
+    <xsd:element name="MediaServiceEventHashCode" ma:index="13" nillable="true" ma:displayName="MediaServiceEventHashCode" ma:hidden="true" ma:internalName="MediaServiceEventHashCode" ma:readOnly="true">
+      <xsd:simpleType>
+        <xsd:restriction base="dms:Text"/>
+      </xsd:simpleType>
+    </xsd:element>
+    <xsd:element name="MediaLengthInSeconds" ma:index="14" nillable="true" ma:displayName="MediaLengthInSeconds" ma:hidden="true" ma:internalName="MediaLengthInSeconds" ma:readOnly="true">
+      <xsd:simpleType>
+        <xsd:restriction base="dms:Unknown"/>
+      </xsd:simpleType>
+    </xsd:element>
+    <xsd:element name="lcf76f155ced4ddcb4097134ff3c332f" ma:index="16" nillable="true" ma:taxonomy="true" ma:internalName="lcf76f155ced4ddcb4097134ff3c332f" ma:taxonomyFieldName="MediaServiceImageTags" ma:displayName="Image Tags" ma:readOnly="false" ma:fieldId="{5cf76f15-5ced-4ddc-b409-7134ff3c332f}" ma:taxonomyMulti="true" ma:sspId="3b76b242-6fdc-4a91-9ac1-a1e9a1762e49" ma:termSetId="09814cd3-568e-fe90-9814-8d621ff8fb84" ma:anchorId="fba54fb3-c3e1-fe81-a776-ca4b69148c4d" ma:open="true" ma:isKeyword="false">
+      <xsd:complexType>
+        <xsd:sequence>
+          <xsd:element ref="pc:Terms" minOccurs="0" maxOccurs="1"/>
+        </xsd:sequence>
+      </xsd:complexType>
+    </xsd:element>
+    <xsd:element name="MediaServiceOCR" ma:index="17" nillable="true" ma:displayName="Extracted Text" ma:internalName="MediaServiceOCR" ma:readOnly="true">
+      <xsd:simpleType>
+        <xsd:restriction base="dms:Note">
+          <xsd:maxLength value="255"/>
+        </xsd:restriction>
+      </xsd:simpleType>
+    </xsd:element>
+  </xsd:schema>
+  <xsd:schema xmlns="http://schemas.openxmlformats.org/package/2006/metadata/core-properties" xmlns:xsd="http://www.w3.org/2001/XMLSchema" xmlns:xsi="http://www.w3.org/2001/XMLSchema-instance" xmlns:dc="http://purl.org/dc/elements/1.1/" xmlns:dcterms="http://purl.org/dc/terms/" xmlns:odoc="http://schemas.microsoft.com/internal/obd" targetNamespace="http://schemas.openxmlformats.org/package/2006/metadata/core-properties" elementFormDefault="qualified" attributeFormDefault="unqualified" blockDefault="#all">
+    <xsd:import namespace="http://purl.org/dc/elements/1.1/" schemaLocation="http://dublincore.org/schemas/xmls/qdc/2003/04/02/dc.xsd"/>
+    <xsd:import namespace="http://purl.org/dc/terms/" schemaLocation="http://dublincore.org/schemas/xmls/qdc/2003/04/02/dcterms.xsd"/>
+    <xsd:element name="coreProperties" type="CT_coreProperties"/>
+    <xsd:complexType name="CT_coreProperties">
+      <xsd:all>
+        <xsd:element ref="dc:creator" minOccurs="0" maxOccurs="1"/>
+        <xsd:element ref="dcterms:created" minOccurs="0" maxOccurs="1"/>
+        <xsd:element ref="dc:identifier" minOccurs="0" maxOccurs="1"/>
+        <xsd:element name="contentType" minOccurs="0" maxOccurs="1" type="xsd:string" ma:index="0" ma:displayName="Content Type"/>
+        <xsd:element ref="dc:title" minOccurs="0" maxOccurs="1" ma:index="4" ma:displayName="Title"/>
+        <xsd:element ref="dc:subject" minOccurs="0" maxOccurs="1"/>
+        <xsd:element ref="dc:description" minOccurs="0" maxOccurs="1"/>
+        <xsd:element name="keywords" minOccurs="0" maxOccurs="1" type="xsd:string"/>
+        <xsd:element ref="dc:language" minOccurs="0" maxOccurs="1"/>
+        <xsd:element name="category" minOccurs="0" maxOccurs="1" type="xsd:string"/>
+        <xsd:element name="version" minOccurs="0" maxOccurs="1" type="xsd:string"/>
+        <xsd:element name="revision" minOccurs="0" maxOccurs="1" type="xsd:string">
+          <xsd:annotation>
+            <xsd:documentation>
+                        This value indicates the number of saves or revisions. The application is responsible for updating this value after each revision.
+                    </xsd:documentation>
+          </xsd:annotation>
+        </xsd:element>
+        <xsd:element name="lastModifiedBy" minOccurs="0" maxOccurs="1" type="xsd:string"/>
+        <xsd:element ref="dcterms:modified" minOccurs="0" maxOccurs="1"/>
+        <xsd:element name="contentStatus" minOccurs="0" maxOccurs="1" type="xsd:string"/>
+      </xsd:all>
+    </xsd:complexType>
+  </xsd:schema>
+  <xs:schema xmlns:pc="http://schemas.microsoft.com/office/infopath/2007/PartnerControls" xmlns:xs="http://www.w3.org/2001/XMLSchema" targetNamespace="http://schemas.microsoft.com/office/infopath/2007/PartnerControls" elementFormDefault="qualified" attributeFormDefault="unqualified">
+    <xs:element name="Person">
+      <xs:complexType>
+        <xs:sequence>
+          <xs:element ref="pc:DisplayName" minOccurs="0"/>
+          <xs:element ref="pc:AccountId" minOccurs="0"/>
+          <xs:element ref="pc:AccountType" minOccurs="0"/>
+        </xs:sequence>
+      </xs:complexType>
+    </xs:element>
+    <xs:element name="DisplayName" type="xs:string"/>
+    <xs:element name="AccountId" type="xs:string"/>
+    <xs:element name="AccountType" type="xs:string"/>
+    <xs:element name="BDCAssociatedEntity">
+      <xs:complexType>
+        <xs:sequence>
+          <xs:element ref="pc:BDCEntity" minOccurs="0" maxOccurs="unbounded"/>
+        </xs:sequence>
+        <xs:attribute ref="pc:EntityNamespace"/>
+        <xs:attribute ref="pc:EntityName"/>
+        <xs:attribute ref="pc:SystemInstanceName"/>
+        <xs:attribute ref="pc:AssociationName"/>
+      </xs:complexType>
+    </xs:element>
+    <xs:attribute name="EntityNamespace" type="xs:string"/>
+    <xs:attribute name="EntityName" type="xs:string"/>
+    <xs:attribute name="SystemInstanceName" type="xs:string"/>
+    <xs:attribute name="AssociationName" type="xs:string"/>
+    <xs:element name="BDCEntity">
+      <xs:complexType>
+        <xs:sequence>
+          <xs:element ref="pc:EntityDisplayName" minOccurs="0"/>
+          <xs:element ref="pc:EntityInstanceReference" minOccurs="0"/>
+          <xs:element ref="pc:EntityId1" minOccurs="0"/>
+          <xs:element ref="pc:EntityId2" minOccurs="0"/>
+          <xs:element ref="pc:EntityId3" minOccurs="0"/>
+          <xs:element ref="pc:EntityId4" minOccurs="0"/>
+          <xs:element ref="pc:EntityId5" minOccurs="0"/>
+        </xs:sequence>
+      </xs:complexType>
+    </xs:element>
+    <xs:element name="EntityDisplayName" type="xs:string"/>
+    <xs:element name="EntityInstanceReference" type="xs:string"/>
+    <xs:element name="EntityId1" type="xs:string"/>
+    <xs:element name="EntityId2" type="xs:string"/>
+    <xs:element name="EntityId3" type="xs:string"/>
+    <xs:element name="EntityId4" type="xs:string"/>
+    <xs:element name="EntityId5" type="xs:string"/>
+    <xs:element name="Terms">
+      <xs:complexType>
+        <xs:sequence>
+          <xs:element ref="pc:TermInfo" minOccurs="0" maxOccurs="unbounded"/>
+        </xs:sequence>
+      </xs:complexType>
+    </xs:element>
+    <xs:element name="TermInfo">
+      <xs:complexType>
+        <xs:sequence>
+          <xs:element ref="pc:TermName" minOccurs="0"/>
+          <xs:element ref="pc:TermId" minOccurs="0"/>
+        </xs:sequence>
+      </xs:complexType>
+    </xs:element>
+    <xs:element name="TermName" type="xs:string"/>
+    <xs:element name="TermId" type="xs:string"/>
+  </xs:schema>
+</ct:contentTypeSchema>
+</file>
+
+<file path=customXml/item2.xml><?xml version="1.0" encoding="utf-8"?>
+<?mso-contentType ?>
+<FormTemplates xmlns="http://schemas.microsoft.com/sharepoint/v3/contenttype/forms">
+  <Display>DocumentLibraryForm</Display>
+  <Edit>DocumentLibraryForm</Edit>
+  <New>DocumentLibraryForm</New>
+</FormTemplates>
+</file>
+
+<file path=customXml/item3.xml><?xml version="1.0" encoding="utf-8"?>
+<p:properties xmlns:p="http://schemas.microsoft.com/office/2006/metadata/properties" xmlns:xsi="http://www.w3.org/2001/XMLSchema-instance" xmlns:pc="http://schemas.microsoft.com/office/infopath/2007/PartnerControls">
+  <documentManagement>
+    <lcf76f155ced4ddcb4097134ff3c332f xmlns="0fb7d555-d2b2-4203-9588-53beb96c1c76">
+      <Terms xmlns="http://schemas.microsoft.com/office/infopath/2007/PartnerControls"/>
+    </lcf76f155ced4ddcb4097134ff3c332f>
+  </documentManagement>
+</p:properties>
+</file>
+
+<file path=customXml/itemProps1.xml><?xml version="1.0" encoding="utf-8"?>
+<ds:datastoreItem xmlns:ds="http://schemas.openxmlformats.org/officeDocument/2006/customXml" ds:itemID="{AF35C0BB-B3BB-49A2-8CE8-B9EB340CF2E1}">
+  <ds:schemaRefs>
+    <ds:schemaRef ds:uri="http://schemas.microsoft.com/office/2006/metadata/contentType"/>
+    <ds:schemaRef ds:uri="http://schemas.microsoft.com/office/2006/metadata/properties/metaAttributes"/>
+    <ds:schemaRef ds:uri="http://www.w3.org/2001/XMLSchema"/>
+    <ds:schemaRef ds:uri="http://schemas.microsoft.com/office/2006/metadata/properties"/>
+    <ds:schemaRef ds:uri="0fb7d555-d2b2-4203-9588-53beb96c1c76"/>
+    <ds:schemaRef ds:uri="http://schemas.microsoft.com/office/2006/documentManagement/types"/>
+    <ds:schemaRef ds:uri="http://schemas.microsoft.com/office/infopath/2007/PartnerControls"/>
+    <ds:schemaRef ds:uri="http://schemas.openxmlformats.org/package/2006/metadata/core-properties"/>
+    <ds:schemaRef ds:uri="http://purl.org/dc/elements/1.1/"/>
+    <ds:schemaRef ds:uri="http://purl.org/dc/terms/"/>
+    <ds:schemaRef ds:uri="http://schemas.microsoft.com/internal/obd"/>
+  </ds:schemaRefs>
+</ds:datastoreItem>
+</file>
+
+<file path=customXml/itemProps2.xml><?xml version="1.0" encoding="utf-8"?>
+<ds:datastoreItem xmlns:ds="http://schemas.openxmlformats.org/officeDocument/2006/customXml" ds:itemID="{4667D244-E61B-4214-81E8-F148110CDDE4}">
+  <ds:schemaRefs>
+    <ds:schemaRef ds:uri="http://schemas.microsoft.com/sharepoint/v3/contenttype/forms"/>
+  </ds:schemaRefs>
+</ds:datastoreItem>
+</file>
+
+<file path=customXml/itemProps3.xml><?xml version="1.0" encoding="utf-8"?>
+<ds:datastoreItem xmlns:ds="http://schemas.openxmlformats.org/officeDocument/2006/customXml" ds:itemID="{8715614D-6C87-4BB4-9B46-F0D584AEE9D0}">
+  <ds:schemaRefs>
+    <ds:schemaRef ds:uri="http://schemas.microsoft.com/office/2006/metadata/properties"/>
+    <ds:schemaRef ds:uri="http://schemas.microsoft.com/office/infopath/2007/PartnerControls"/>
+    <ds:schemaRef ds:uri="0fb7d555-d2b2-4203-9588-53beb96c1c76"/>
+  </ds:schemaRefs>
+</ds:datastoreItem>
+</file>
+
+<file path=docMetadata/LabelInfo.xml><?xml version="1.0" encoding="utf-8"?>
+<clbl:labelList xmlns:clbl="http://schemas.microsoft.com/office/2020/mipLabelMetadata">
+  <clbl:label id="{9aee26d8-97c2-4fad-8900-96735f6dc73f}" enabled="0" method="" siteId="{9aee26d8-97c2-4fad-8900-96735f6dc73f}" removed="1"/>
+</clbl:labelList>
 </file>
</xml_diff>